<commit_message>
updated portfolio LG5 and weekly reflections
</commit_message>
<xml_diff>
--- a/Portfolio.docx
+++ b/Portfolio.docx
@@ -227,19 +227,10 @@
         <w:t>Week 5:</w:t>
       </w:r>
       <w:r>
-        <w:t xml:space="preserve"> do more QA for the presentation</w:t>
-      </w:r>
-    </w:p>
-    <w:p>
-      <w:pPr>
-        <w:pStyle w:val="ListParagraph"/>
-        <w:numPr>
-          <w:ilvl w:val="0"/>
-          <w:numId w:val="1"/>
-        </w:numPr>
-      </w:pPr>
-      <w:r>
-        <w:t>Week 6: reflect on the pesentation</w:t>
+        <w:t xml:space="preserve"> </w:t>
+      </w:r>
+      <w:r>
+        <w:t>help prepare the presentation</w:t>
       </w:r>
     </w:p>
     <w:p/>
@@ -414,6 +405,16 @@
     <w:p>
       <w:r>
         <w:t>I was assigned QA for the presentation slides, however the day before the lesson the slides were still empty so I contacted the group to remind them to upload their information.</w:t>
+      </w:r>
+    </w:p>
+    <w:p>
+      <w:r>
+        <w:t>Week 5:</w:t>
+      </w:r>
+    </w:p>
+    <w:p>
+      <w:r>
+        <w:t>I discussed organization with the group to maybe help prevent leaving everything to the last day and organize the tasks with deadlines and minimum requirements. I also informed colleagues about changes to the presentation and some quality standards to follow.</w:t>
       </w:r>
     </w:p>
     <w:p/>

</xml_diff>